<commit_message>
Actualización: Se agrega una carpeta con el documento de analisis de requerimientos
</commit_message>
<xml_diff>
--- a/Documentos/SDD/P03-SDD_SecD13_Team_02_Funcionality_agregarRecurso1.0.0.docx
+++ b/Documentos/SDD/P03-SDD_SecD13_Team_02_Funcionality_agregarRecurso1.0.0.docx
@@ -7502,15 +7502,35 @@
         <w:rPr>
           <w:b/>
         </w:rPr>
-        <w:t>Secuencia</w:t>
+        <w:t>m</w:t>
+      </w:r>
+      <w:r>
+        <w:rPr>
+          <w:b/>
+        </w:rPr>
+        <w:t>á</w:t>
+      </w:r>
+      <w:r>
+        <w:rPr>
+          <w:b/>
+        </w:rPr>
+        <w:t>quina</w:t>
       </w:r>
       <w:proofErr w:type="spellEnd"/>
       <w:r>
         <w:rPr>
           <w:b/>
         </w:rPr>
-        <w:t xml:space="preserve"> </w:t>
-      </w:r>
+        <w:t xml:space="preserve"> de </w:t>
+      </w:r>
+      <w:proofErr w:type="spellStart"/>
+      <w:r>
+        <w:rPr>
+          <w:b/>
+        </w:rPr>
+        <w:t>estados</w:t>
+      </w:r>
+      <w:proofErr w:type="spellEnd"/>
     </w:p>
     <w:p>
       <w:pPr>
@@ -8757,7 +8777,7 @@
       <w:framePr w:hSpace="142" w:wrap="around" w:vAnchor="page" w:hAnchor="page" w:x="1" w:y="1929"/>
     </w:pPr>
     <w:r>
-      <w:object w:dxaOrig="709" w:dyaOrig="3910" w14:anchorId="66E90C04">
+      <w:object w:dxaOrig="720" w:dyaOrig="3898" w14:anchorId="66E90C04">
         <v:shapetype id="_x0000_t75" coordsize="21600,21600" o:spt="75" o:preferrelative="t" path="m@4@5l@4@11@9@11@9@5xe" filled="f" stroked="f">
           <v:stroke joinstyle="miter"/>
           <v:formulas>
@@ -8777,10 +8797,10 @@
           <v:path o:extrusionok="f" gradientshapeok="t" o:connecttype="rect"/>
           <o:lock v:ext="edit" aspectratio="t"/>
         </v:shapetype>
-        <v:shape id="_x0000_i1025" type="#_x0000_t75" style="width:36pt;height:194.9pt">
+        <v:shape id="_x0000_i1025" type="#_x0000_t75" style="width:36pt;height:195pt">
           <v:imagedata r:id="rId1" o:title=""/>
         </v:shape>
-        <o:OLEObject Type="Embed" ProgID="Designer" ShapeID="_x0000_i1025" DrawAspect="Content" ObjectID="_1837612664" r:id="rId2">
+        <o:OLEObject Type="Embed" ProgID="Designer" ShapeID="_x0000_i1025" DrawAspect="Content" ObjectID="_1838135991" r:id="rId2">
           <o:FieldCodes>\s \* MERGEFORMAT</o:FieldCodes>
         </o:OLEObject>
       </w:object>
@@ -8791,11 +8811,11 @@
       <w:framePr w:hSpace="142" w:wrap="around" w:vAnchor="page" w:hAnchor="page" w:x="1" w:y="6635"/>
     </w:pPr>
     <w:r>
-      <w:object w:dxaOrig="853" w:dyaOrig="3356" w14:anchorId="157ED357">
-        <v:shape id="_x0000_i1026" type="#_x0000_t75" style="width:42.2pt;height:167.6pt" fillcolor="window">
+      <w:object w:dxaOrig="844" w:dyaOrig="3352" w14:anchorId="157ED357">
+        <v:shape id="_x0000_i1026" type="#_x0000_t75" style="width:42pt;height:167.5pt" fillcolor="window">
           <v:imagedata r:id="rId3" o:title=""/>
         </v:shape>
-        <o:OLEObject Type="Embed" ProgID="Designer" ShapeID="_x0000_i1026" DrawAspect="Content" ObjectID="_1837612665" r:id="rId4">
+        <o:OLEObject Type="Embed" ProgID="Designer" ShapeID="_x0000_i1026" DrawAspect="Content" ObjectID="_1838135992" r:id="rId4">
           <o:FieldCodes>\s \* MERGEFORMAT</o:FieldCodes>
         </o:OLEObject>
       </w:object>

</xml_diff>